<commit_message>
Update CV PDF with Lily Wu award; group Microcosms presentations and add invited talks
</commit_message>
<xml_diff>
--- a/Faith Ann Couts_Curriculum Vitae_08.17.26.docx
+++ b/Faith Ann Couts_Curriculum Vitae_08.17.26.docx
@@ -4174,7 +4174,14 @@
           <w:sz w:val="22"/>
           <w:szCs w:val="22"/>
         </w:rPr>
-        <w:t xml:space="preserve"> Department of Sociology, School of Social Sciences, University of California, Irvine. Expected completion May 2026.</w:t>
+        <w:t xml:space="preserve"> Department of Sociology, School of Social Sciences, University of California, Irvine. </w:t>
+      </w:r>
+      <w:r>
+        <w:rPr>
+          <w:rFonts w:ascii="Garamond" w:hAnsi="Garamond"/>
+          <w:sz w:val="22"/>
+        </w:rPr>
+        <w:t>Recipient, 2025–26 Award for Excellence in Upper-Division Academic Writing in Social Sciences and Social Ecology.</w:t>
       </w:r>
     </w:p>
     <w:p>
@@ -4900,6 +4907,7 @@
           <w:sz w:val="22"/>
           <w:szCs w:val="22"/>
         </w:rPr>
+        <w:lastRenderedPageBreak/>
         <w:tab/>
       </w:r>
     </w:p>
@@ -4921,7 +4929,6 @@
           <w:sz w:val="22"/>
           <w:szCs w:val="22"/>
         </w:rPr>
-        <w:lastRenderedPageBreak/>
         <w:t>University and Professional Service</w:t>
       </w:r>
     </w:p>
@@ -7221,7 +7228,6 @@
           <w:sz w:val="22"/>
           <w:szCs w:val="22"/>
         </w:rPr>
-        <w:lastRenderedPageBreak/>
         <w:t>2022</w:t>
       </w:r>
       <w:r>

</xml_diff>

<commit_message>
Add MUST Lab link; remove Richard Arum from Microcosms co-author list (site + CV)
</commit_message>
<xml_diff>
--- a/Faith Ann Couts_Curriculum Vitae_08.17.26.docx
+++ b/Faith Ann Couts_Curriculum Vitae_08.17.26.docx
@@ -1752,16 +1752,15 @@
           <w:sz w:val="22"/>
           <w:szCs w:val="22"/>
         </w:rPr>
-        <w:t xml:space="preserve">Danielle Shariff, </w:t>
-      </w:r>
-      <w:r>
-        <w:rPr>
-          <w:rFonts w:ascii="Garamond" w:eastAsia="Helvetica Neue" w:hAnsi="Garamond"/>
-          <w:iCs/>
-          <w:sz w:val="22"/>
-          <w:szCs w:val="22"/>
-        </w:rPr>
-        <w:t>and Richard Arum.</w:t>
+        <w:t>and Danielle Shariff.</w:t>
+      </w:r>
+      <w:r>
+        <w:rPr>
+          <w:rFonts w:ascii="Garamond" w:eastAsia="Helvetica Neue" w:hAnsi="Garamond"/>
+          <w:iCs/>
+          <w:sz w:val="22"/>
+          <w:szCs w:val="22"/>
+        </w:rPr>
       </w:r>
       <w:r>
         <w:rPr>
@@ -2329,7 +2328,7 @@
           <w:sz w:val="22"/>
           <w:szCs w:val="22"/>
         </w:rPr>
-        <w:t>With Enrique Valencia López,</w:t>
+        <w:t>With Enrique Valencia López</w:t>
       </w:r>
       <w:r>
         <w:rPr>
@@ -2345,15 +2344,14 @@
           <w:sz w:val="22"/>
           <w:szCs w:val="22"/>
         </w:rPr>
-        <w:t xml:space="preserve">Danielle Shariff, </w:t>
-      </w:r>
-      <w:r>
-        <w:rPr>
-          <w:rFonts w:ascii="Garamond" w:eastAsia="Helvetica Neue" w:hAnsi="Garamond"/>
-          <w:sz w:val="22"/>
-          <w:szCs w:val="22"/>
-        </w:rPr>
-        <w:t>and Richard Arum. (</w:t>
+        <w:t>and Danielle Shariff. (</w:t>
+      </w:r>
+      <w:r>
+        <w:rPr>
+          <w:rFonts w:ascii="Garamond" w:eastAsia="Helvetica Neue" w:hAnsi="Garamond"/>
+          <w:sz w:val="22"/>
+          <w:szCs w:val="22"/>
+        </w:rPr>
       </w:r>
       <w:r>
         <w:rPr>
@@ -2473,7 +2471,7 @@
           <w:sz w:val="22"/>
           <w:szCs w:val="22"/>
         </w:rPr>
-        <w:t>With Enrique Valencia López,</w:t>
+        <w:t>With Enrique Valencia López</w:t>
       </w:r>
       <w:r>
         <w:rPr>
@@ -2489,15 +2487,14 @@
           <w:sz w:val="22"/>
           <w:szCs w:val="22"/>
         </w:rPr>
-        <w:t xml:space="preserve">Danielle Shariff </w:t>
-      </w:r>
-      <w:r>
-        <w:rPr>
-          <w:rFonts w:ascii="Garamond" w:eastAsia="Helvetica Neue" w:hAnsi="Garamond"/>
-          <w:sz w:val="22"/>
-          <w:szCs w:val="22"/>
-        </w:rPr>
-        <w:t>and Richard Arum. (</w:t>
+        <w:t>and Danielle Shariff. (</w:t>
+      </w:r>
+      <w:r>
+        <w:rPr>
+          <w:rFonts w:ascii="Garamond" w:eastAsia="Helvetica Neue" w:hAnsi="Garamond"/>
+          <w:sz w:val="22"/>
+          <w:szCs w:val="22"/>
+        </w:rPr>
       </w:r>
       <w:r>
         <w:rPr>
@@ -2741,23 +2738,21 @@
           <w:sz w:val="22"/>
           <w:szCs w:val="22"/>
         </w:rPr>
-        <w:t>, CA. With Enrique Valencia López,</w:t>
-      </w:r>
-      <w:r>
-        <w:rPr>
-          <w:rFonts w:ascii="Garamond" w:eastAsia="Helvetica Neue" w:hAnsi="Garamond"/>
-          <w:sz w:val="22"/>
-          <w:szCs w:val="22"/>
-        </w:rPr>
-        <w:t xml:space="preserve"> </w:t>
-      </w:r>
-      <w:r>
-        <w:rPr>
-          <w:rFonts w:ascii="Garamond" w:eastAsia="Helvetica Neue" w:hAnsi="Garamond"/>
-          <w:sz w:val="22"/>
-          <w:szCs w:val="22"/>
-        </w:rPr>
-        <w:t>and Richard Arum. (</w:t>
+        <w:t>, CA. With Enrique Valencia López. (</w:t>
+      </w:r>
+      <w:r>
+        <w:rPr>
+          <w:rFonts w:ascii="Garamond" w:eastAsia="Helvetica Neue" w:hAnsi="Garamond"/>
+          <w:sz w:val="22"/>
+          <w:szCs w:val="22"/>
+        </w:rPr>
+      </w:r>
+      <w:r>
+        <w:rPr>
+          <w:rFonts w:ascii="Garamond" w:eastAsia="Helvetica Neue" w:hAnsi="Garamond"/>
+          <w:sz w:val="22"/>
+          <w:szCs w:val="22"/>
+        </w:rPr>
       </w:r>
       <w:r>
         <w:rPr>

</xml_diff>